<commit_message>
Update diagrams, exercse and slides
</commit_message>
<xml_diff>
--- a/05 Thread Synchronization 1/Thread Synchronization - Exercises.docx
+++ b/05 Thread Synchronization 1/Thread Synchronization - Exercises.docx
@@ -1,6 +1,6 @@
 
 <file path=word/document.xml><?xml version="1.0" encoding="utf-8"?>
-<w:document xmlns:wpc="http://schemas.microsoft.com/office/word/2010/wordprocessingCanvas" xmlns:cx="http://schemas.microsoft.com/office/drawing/2014/chartex" xmlns:cx1="http://schemas.microsoft.com/office/drawing/2015/9/8/chartex" xmlns:cx2="http://schemas.microsoft.com/office/drawing/2015/10/21/chartex" xmlns:cx3="http://schemas.microsoft.com/office/drawing/2016/5/9/chartex" xmlns:cx4="http://schemas.microsoft.com/office/drawing/2016/5/10/chartex" xmlns:cx5="http://schemas.microsoft.com/office/drawing/2016/5/11/chartex" xmlns:cx6="http://schemas.microsoft.com/office/drawing/2016/5/12/chartex" xmlns:cx7="http://schemas.microsoft.com/office/drawing/2016/5/13/chartex" xmlns:cx8="http://schemas.microsoft.com/office/drawing/2016/5/14/chartex" xmlns:mc="http://schemas.openxmlformats.org/markup-compatibility/2006" xmlns:aink="http://schemas.microsoft.com/office/drawing/2016/ink" xmlns:am3d="http://schemas.microsoft.com/office/drawing/2017/model3d" xmlns:o="urn:schemas-microsoft-com:office:office" xmlns:oel="http://schemas.microsoft.com/office/2019/extlst" xmlns:r="http://schemas.openxmlformats.org/officeDocument/2006/relationships" xmlns:m="http://schemas.openxmlformats.org/officeDocument/2006/math" xmlns:v="urn:schemas-microsoft-com:vml" xmlns:wp14="http://schemas.microsoft.com/office/word/2010/wordprocessingDrawing" xmlns:wp="http://schemas.openxmlformats.org/drawingml/2006/wordprocessingDrawing" xmlns:w10="urn:schemas-microsoft-com:office:word" xmlns:w="http://schemas.openxmlformats.org/wordprocessingml/2006/main" xmlns:w14="http://schemas.microsoft.com/office/word/2010/wordml" xmlns:w15="http://schemas.microsoft.com/office/word/2012/wordml" xmlns:w16cex="http://schemas.microsoft.com/office/word/2018/wordml/cex" xmlns:w16cid="http://schemas.microsoft.com/office/word/2016/wordml/cid" xmlns:w16="http://schemas.microsoft.com/office/word/2018/wordml" xmlns:w16du="http://schemas.microsoft.com/office/word/2023/wordml/word16du" xmlns:w16sdtdh="http://schemas.microsoft.com/office/word/2020/wordml/sdtdatahash" xmlns:w16sdtfl="http://schemas.microsoft.com/office/word/2024/wordml/sdtformatlock" xmlns:w16se="http://schemas.microsoft.com/office/word/2015/wordml/symex" xmlns:wpg="http://schemas.microsoft.com/office/word/2010/wordprocessingGroup" xmlns:wpi="http://schemas.microsoft.com/office/word/2010/wordprocessingInk" xmlns:wne="http://schemas.microsoft.com/office/word/2006/wordml" xmlns:wps="http://schemas.microsoft.com/office/word/2010/wordprocessingShape" mc:Ignorable="w14 w15 w16se w16cid w16 w16cex w16sdtdh w16sdtfl w16du wp14">
+<w:document xmlns:wpc="http://schemas.microsoft.com/office/word/2010/wordprocessingCanvas" xmlns:cx="http://schemas.microsoft.com/office/drawing/2014/chartex" xmlns:cx1="http://schemas.microsoft.com/office/drawing/2015/9/8/chartex" xmlns:cx2="http://schemas.microsoft.com/office/drawing/2015/10/21/chartex" xmlns:cx3="http://schemas.microsoft.com/office/drawing/2016/5/9/chartex" xmlns:cx4="http://schemas.microsoft.com/office/drawing/2016/5/10/chartex" xmlns:cx5="http://schemas.microsoft.com/office/drawing/2016/5/11/chartex" xmlns:cx6="http://schemas.microsoft.com/office/drawing/2016/5/12/chartex" xmlns:cx7="http://schemas.microsoft.com/office/drawing/2016/5/13/chartex" xmlns:cx8="http://schemas.microsoft.com/office/drawing/2016/5/14/chartex" xmlns:mc="http://schemas.openxmlformats.org/markup-compatibility/2006" xmlns:m="http://schemas.openxmlformats.org/officeDocument/2006/math" xmlns:aink="http://schemas.microsoft.com/office/drawing/2016/ink" xmlns:am3d="http://schemas.microsoft.com/office/drawing/2017/model3d" xmlns:oel="http://schemas.microsoft.com/office/2019/extlst" xmlns:r="http://schemas.openxmlformats.org/officeDocument/2006/relationships" xmlns:wp14="http://schemas.microsoft.com/office/word/2010/wordprocessingDrawing" xmlns:wp="http://schemas.openxmlformats.org/drawingml/2006/wordprocessingDrawing" xmlns:wpg="http://schemas.microsoft.com/office/word/2010/wordprocessingGroup" xmlns:wpi="http://schemas.microsoft.com/office/word/2010/wordprocessingInk" xmlns:wps="http://schemas.microsoft.com/office/word/2010/wordprocessingShape" xmlns:o="urn:schemas-microsoft-com:office:office" xmlns:v="urn:schemas-microsoft-com:vml" xmlns:w10="urn:schemas-microsoft-com:office:word" xmlns:w="http://schemas.openxmlformats.org/wordprocessingml/2006/main" xmlns:w14="http://schemas.microsoft.com/office/word/2010/wordml" xmlns:w15="http://schemas.microsoft.com/office/word/2012/wordml" xmlns:w16cex="http://schemas.microsoft.com/office/word/2018/wordml/cex" xmlns:w16cid="http://schemas.microsoft.com/office/word/2016/wordml/cid" xmlns:w16="http://schemas.microsoft.com/office/word/2018/wordml" xmlns:w16sdtdh="http://schemas.microsoft.com/office/word/2020/wordml/sdtdatahash" xmlns:w16sdtfl="http://schemas.microsoft.com/office/word/2024/wordml/sdtformatlock" xmlns:w16se="http://schemas.microsoft.com/office/word/2015/wordml/symex" xmlns:w16du="http://schemas.microsoft.com/office/word/2023/wordml/word16du" xmlns:wne="http://schemas.microsoft.com/office/word/2006/wordml" mc:Ignorable="w14 w15 w16se w16cid w16 w16cex w16sdtdh w16sdtfl w16du wp14">
   <w:body>
     <w:p>
       <w:pPr>
@@ -214,7 +214,19 @@
         <w:rPr>
           <w:lang w:val="en-US"/>
         </w:rPr>
-        <w:t xml:space="preserve"> member variable and get/set methods</w:t>
+        <w:t xml:space="preserve"> member variable and get/</w:t>
+      </w:r>
+      <w:r>
+        <w:rPr>
+          <w:lang w:val="en-US"/>
+        </w:rPr>
+        <w:t>increment</w:t>
+      </w:r>
+      <w:r>
+        <w:rPr>
+          <w:lang w:val="en-US"/>
+        </w:rPr>
+        <w:t xml:space="preserve"> methods</w:t>
       </w:r>
       <w:r>
         <w:rPr>
@@ -557,13 +569,15 @@
       </w:pPr>
       <w:r>
         <w:rPr>
+          <w:iCs/>
           <w:noProof/>
+          <w:lang w:val="en-US"/>
         </w:rPr>
         <w:drawing>
-          <wp:inline distT="0" distB="0" distL="0" distR="0" wp14:anchorId="3A3B4326" wp14:editId="05AE0E9A">
-            <wp:extent cx="4103827" cy="1386396"/>
+          <wp:inline distT="0" distB="0" distL="0" distR="0" wp14:anchorId="3868A510" wp14:editId="57976446">
+            <wp:extent cx="5473700" cy="1663700"/>
             <wp:effectExtent l="0" t="0" r="0" b="0"/>
-            <wp:docPr id="249676851" name="Picture 1" descr="A black background with white squares&#10;&#10;AI-generated content may be incorrect."/>
+            <wp:docPr id="1418499363" name="Picture 2"/>
             <wp:cNvGraphicFramePr>
               <a:graphicFrameLocks xmlns:a="http://schemas.openxmlformats.org/drawingml/2006/main" noChangeAspect="1"/>
             </wp:cNvGraphicFramePr>
@@ -571,36 +585,29 @@
               <a:graphicData uri="http://schemas.openxmlformats.org/drawingml/2006/picture">
                 <pic:pic xmlns:pic="http://schemas.openxmlformats.org/drawingml/2006/picture">
                   <pic:nvPicPr>
-                    <pic:cNvPr id="249676851" name="Picture 1" descr="A black background with white squares&#10;&#10;AI-generated content may be incorrect."/>
-                    <pic:cNvPicPr>
-                      <a:picLocks noChangeAspect="1" noChangeArrowheads="1"/>
-                    </pic:cNvPicPr>
+                    <pic:cNvPr id="1418499363" name="Picture 1418499363"/>
+                    <pic:cNvPicPr/>
                   </pic:nvPicPr>
                   <pic:blipFill>
-                    <a:blip r:embed="rId7" cstate="print">
+                    <a:blip r:embed="rId7">
                       <a:extLst>
                         <a:ext uri="{28A0092B-C50C-407E-A947-70E740481C1C}">
                           <a14:useLocalDpi xmlns:a14="http://schemas.microsoft.com/office/drawing/2010/main" val="0"/>
                         </a:ext>
                       </a:extLst>
                     </a:blip>
-                    <a:srcRect/>
                     <a:stretch>
                       <a:fillRect/>
                     </a:stretch>
                   </pic:blipFill>
-                  <pic:spPr bwMode="auto">
+                  <pic:spPr>
                     <a:xfrm>
                       <a:off x="0" y="0"/>
-                      <a:ext cx="4129832" cy="1395181"/>
+                      <a:ext cx="5473700" cy="1663700"/>
                     </a:xfrm>
                     <a:prstGeom prst="rect">
                       <a:avLst/>
                     </a:prstGeom>
-                    <a:noFill/>
-                    <a:ln>
-                      <a:noFill/>
-                    </a:ln>
                   </pic:spPr>
                 </pic:pic>
               </a:graphicData>
@@ -1333,27 +1340,20 @@
         </w:rPr>
         <w:t xml:space="preserve">Hint: </w:t>
       </w:r>
-      <w:r>
-        <w:fldChar w:fldCharType="begin"/>
-      </w:r>
-      <w:r>
-        <w:rPr>
-          <w:lang w:val="en-US"/>
-        </w:rPr>
-        <w:instrText>HYPERLINK "https://www.wpf-tutorial.com/dialogs/the-openfiledialog/"</w:instrText>
-      </w:r>
-      <w:r>
-        <w:fldChar w:fldCharType="separate"/>
-      </w:r>
-      <w:r>
-        <w:rPr>
-          <w:rStyle w:val="Hyperlink"/>
-          <w:lang w:val="en-US"/>
-        </w:rPr>
-        <w:t>https://www.wpf-tutorial.com/dialogs/the-openfiledialog/</w:t>
-      </w:r>
-      <w:r>
-        <w:fldChar w:fldCharType="end"/>
+      <w:hyperlink r:id="rId9" w:history="1">
+        <w:r>
+          <w:rPr>
+            <w:rStyle w:val="Hyperlink"/>
+            <w:lang w:val="en-US"/>
+          </w:rPr>
+          <w:t>https://learn.microsoft.com/en-us/dotnet/maui/platform-integration/storage/file-picker</w:t>
+        </w:r>
+      </w:hyperlink>
+      <w:r>
+        <w:rPr>
+          <w:lang w:val="en-US"/>
+        </w:rPr>
+        <w:t xml:space="preserve"> </w:t>
       </w:r>
     </w:p>
     <w:p>
@@ -1615,25 +1615,20 @@
           <w:lang w:val="en-US"/>
         </w:rPr>
       </w:pPr>
-      <w:r>
-        <w:rPr>
-          <w:lang w:val="en-US"/>
-        </w:rPr>
-        <w:t xml:space="preserve">Use a single </w:t>
-      </w:r>
-      <w:proofErr w:type="spellStart"/>
-      <w:r>
-        <w:rPr>
-          <w:lang w:val="en-US"/>
-        </w:rPr>
-        <w:t>BackgroundWorker</w:t>
-      </w:r>
-      <w:proofErr w:type="spellEnd"/>
-      <w:r>
-        <w:rPr>
-          <w:lang w:val="en-US"/>
-        </w:rPr>
-        <w:t xml:space="preserve"> to process the files one at the time.</w:t>
+    </w:p>
+    <w:p>
+      <w:pPr>
+        <w:rPr>
+          <w:b/>
+          <w:lang w:val="en-US"/>
+        </w:rPr>
+      </w:pPr>
+      <w:r>
+        <w:rPr>
+          <w:b/>
+          <w:lang w:val="en-US"/>
+        </w:rPr>
+        <w:t>Advanced exercise A5:</w:t>
       </w:r>
     </w:p>
     <w:p>
@@ -1644,20 +1639,11 @@
           <w:lang w:val="en-US"/>
         </w:rPr>
       </w:pPr>
-    </w:p>
-    <w:p>
-      <w:pPr>
-        <w:rPr>
-          <w:b/>
-          <w:lang w:val="en-US"/>
-        </w:rPr>
-      </w:pPr>
-      <w:r>
-        <w:rPr>
-          <w:b/>
-          <w:lang w:val="en-US"/>
-        </w:rPr>
-        <w:t>Advanced exercise A5:</w:t>
+      <w:r>
+        <w:rPr>
+          <w:lang w:val="en-US"/>
+        </w:rPr>
+        <w:t xml:space="preserve">Modify your card counting application, so all files are processed in parallel, i.e. each file is processed by a separate </w:t>
       </w:r>
     </w:p>
     <w:p>
@@ -1672,290 +1658,278 @@
         <w:rPr>
           <w:lang w:val="en-US"/>
         </w:rPr>
-        <w:t xml:space="preserve">Modify your card counting application, so all files are processed in parallel, i.e. each file is processed by a separate </w:t>
+        <w:t>Verify that the count is still correct.</w:t>
+      </w:r>
+    </w:p>
+    <w:p>
+      <w:pPr>
+        <w:rPr>
+          <w:lang w:val="en-US"/>
+        </w:rPr>
+      </w:pPr>
+    </w:p>
+    <w:p>
+      <w:pPr>
+        <w:rPr>
+          <w:lang w:val="en-US"/>
+        </w:rPr>
+      </w:pPr>
+    </w:p>
+    <w:p>
+      <w:pPr>
+        <w:rPr>
+          <w:b/>
+          <w:lang w:val="en-US"/>
+        </w:rPr>
+      </w:pPr>
+      <w:r>
+        <w:rPr>
+          <w:b/>
+          <w:lang w:val="en-US"/>
+        </w:rPr>
+        <w:t>Advanced exercise A6</w:t>
+      </w:r>
+      <w:r>
+        <w:rPr>
+          <w:b/>
+          <w:lang w:val="en-US"/>
+        </w:rPr>
+        <w:t xml:space="preserve"> (We haven’t done network yet – so ask for help </w:t>
+      </w:r>
+      <w:r>
+        <w:rPr>
+          <w:b/>
+          <w:lang w:val="en-US"/>
+        </w:rPr>
+        <w:sym w:font="Wingdings" w:char="F04A"/>
+      </w:r>
+      <w:r>
+        <w:rPr>
+          <w:b/>
+          <w:lang w:val="en-US"/>
+        </w:rPr>
+        <w:t xml:space="preserve"> )</w:t>
+      </w:r>
+      <w:r>
+        <w:rPr>
+          <w:b/>
+          <w:lang w:val="en-US"/>
+        </w:rPr>
+        <w:t>:</w:t>
+      </w:r>
+    </w:p>
+    <w:p>
+      <w:pPr>
+        <w:rPr>
+          <w:lang w:val="en-US"/>
+        </w:rPr>
+      </w:pPr>
+      <w:r>
+        <w:rPr>
+          <w:lang w:val="en-US"/>
+        </w:rPr>
+        <w:t>It has become increasingly difficult to sell the console chat program you wrote in the previous exercise.</w:t>
+      </w:r>
+    </w:p>
+    <w:p>
+      <w:pPr>
+        <w:rPr>
+          <w:lang w:val="en-US"/>
+        </w:rPr>
+      </w:pPr>
+      <w:r>
+        <w:rPr>
+          <w:lang w:val="en-US"/>
+        </w:rPr>
+        <w:t xml:space="preserve">Youngsters have stopped using the console… they want nice and shiny </w:t>
+      </w:r>
+      <w:proofErr w:type="gramStart"/>
+      <w:r>
+        <w:rPr>
+          <w:lang w:val="en-US"/>
+        </w:rPr>
+        <w:t xml:space="preserve">MAUI </w:t>
+      </w:r>
+      <w:r>
+        <w:rPr>
+          <w:lang w:val="en-US"/>
+        </w:rPr>
+        <w:t xml:space="preserve"> programs</w:t>
+      </w:r>
+      <w:proofErr w:type="gramEnd"/>
+      <w:r>
+        <w:rPr>
+          <w:lang w:val="en-US"/>
+        </w:rPr>
+        <w:t xml:space="preserve"> instead. </w:t>
+      </w:r>
+    </w:p>
+    <w:p>
+      <w:pPr>
+        <w:rPr>
+          <w:lang w:val="en-US"/>
+        </w:rPr>
+      </w:pPr>
+      <w:r>
+        <w:rPr>
+          <w:lang w:val="en-US"/>
+        </w:rPr>
+        <w:t>And all the old people have either bought your program or are using Linux.</w:t>
+      </w:r>
+    </w:p>
+    <w:p>
+      <w:pPr>
+        <w:rPr>
+          <w:lang w:val="en-US"/>
+        </w:rPr>
+      </w:pPr>
+    </w:p>
+    <w:p>
+      <w:pPr>
+        <w:rPr>
+          <w:i/>
+          <w:lang w:val="en-US"/>
+        </w:rPr>
+      </w:pPr>
+      <w:r>
+        <w:rPr>
+          <w:i/>
+          <w:lang w:val="en-US"/>
+        </w:rPr>
+        <w:t>So…</w:t>
+      </w:r>
+    </w:p>
+    <w:p>
+      <w:pPr>
+        <w:rPr>
+          <w:lang w:val="en-US"/>
+        </w:rPr>
+      </w:pPr>
+      <w:r>
+        <w:rPr>
+          <w:lang w:val="en-US"/>
+        </w:rPr>
+        <w:t xml:space="preserve">Your mission, </w:t>
+      </w:r>
+      <w:r>
+        <w:rPr>
+          <w:i/>
+          <w:lang w:val="en-US"/>
+        </w:rPr>
+        <w:t>should you choose to accept it</w:t>
+      </w:r>
+      <w:r>
+        <w:rPr>
+          <w:lang w:val="en-US"/>
+        </w:rPr>
+        <w:t xml:space="preserve">, is to create a </w:t>
+      </w:r>
+      <w:r>
+        <w:rPr>
+          <w:lang w:val="en-US"/>
+        </w:rPr>
+        <w:t>MAUI</w:t>
+      </w:r>
+      <w:r>
+        <w:rPr>
+          <w:lang w:val="en-US"/>
+        </w:rPr>
+        <w:t xml:space="preserve"> chat program.</w:t>
+      </w:r>
+    </w:p>
+    <w:p>
+      <w:pPr>
+        <w:rPr>
+          <w:lang w:val="en-US"/>
+        </w:rPr>
+      </w:pPr>
+      <w:r>
+        <w:rPr>
+          <w:lang w:val="en-US"/>
+        </w:rPr>
+        <w:t xml:space="preserve">When your program starts, it shall connect to a chat program on one of your fellow </w:t>
+      </w:r>
+      <w:proofErr w:type="gramStart"/>
+      <w:r>
+        <w:rPr>
+          <w:lang w:val="en-US"/>
+        </w:rPr>
+        <w:t>students</w:t>
+      </w:r>
+      <w:proofErr w:type="gramEnd"/>
+      <w:r>
+        <w:rPr>
+          <w:lang w:val="en-US"/>
+        </w:rPr>
+        <w:t xml:space="preserve"> computers.</w:t>
+      </w:r>
+    </w:p>
+    <w:p>
+      <w:pPr>
+        <w:rPr>
+          <w:lang w:val="en-US"/>
+        </w:rPr>
+      </w:pPr>
+      <w:r>
+        <w:rPr>
+          <w:lang w:val="en-US"/>
+        </w:rPr>
+        <w:t>The text you enter shall be sent to the other computer and displayed in a nice chat window.</w:t>
+      </w:r>
+    </w:p>
+    <w:p>
+      <w:pPr>
+        <w:rPr>
+          <w:lang w:val="en-US"/>
+        </w:rPr>
+      </w:pPr>
+      <w:r>
+        <w:rPr>
+          <w:lang w:val="en-US"/>
+        </w:rPr>
+        <w:t>Likewise, text entered on the other computer shall be sent to your computer and displayed in a nice chat window.</w:t>
+      </w:r>
+    </w:p>
+    <w:p>
+      <w:pPr>
+        <w:rPr>
+          <w:lang w:val="en-US"/>
+        </w:rPr>
+      </w:pPr>
+    </w:p>
+    <w:p>
+      <w:pPr>
+        <w:rPr>
+          <w:lang w:val="en-US"/>
+        </w:rPr>
+      </w:pPr>
+      <w:r>
+        <w:rPr>
+          <w:lang w:val="en-US"/>
+        </w:rPr>
+        <w:t xml:space="preserve">Hint: You will probably still need a </w:t>
       </w:r>
       <w:proofErr w:type="spellStart"/>
       <w:r>
         <w:rPr>
-          <w:lang w:val="en-US"/>
-        </w:rPr>
-        <w:t>BackgroundWorker</w:t>
+          <w:i/>
+          <w:lang w:val="en-US"/>
+        </w:rPr>
+        <w:t>TCPListener</w:t>
       </w:r>
       <w:proofErr w:type="spellEnd"/>
       <w:r>
         <w:rPr>
           <w:lang w:val="en-US"/>
         </w:rPr>
-        <w:t>.</w:t>
-      </w:r>
-    </w:p>
-    <w:p>
-      <w:pPr>
-        <w:keepNext/>
-        <w:keepLines/>
-        <w:rPr>
-          <w:lang w:val="en-US"/>
-        </w:rPr>
-      </w:pPr>
-      <w:r>
-        <w:rPr>
-          <w:lang w:val="en-US"/>
-        </w:rPr>
-        <w:t>Verify that the count is still correct.</w:t>
-      </w:r>
-    </w:p>
-    <w:p>
-      <w:pPr>
-        <w:rPr>
-          <w:lang w:val="en-US"/>
-        </w:rPr>
-      </w:pPr>
-    </w:p>
-    <w:p>
-      <w:pPr>
-        <w:rPr>
-          <w:lang w:val="en-US"/>
-        </w:rPr>
-      </w:pPr>
-    </w:p>
-    <w:p>
-      <w:pPr>
-        <w:rPr>
-          <w:b/>
-          <w:lang w:val="en-US"/>
-        </w:rPr>
-      </w:pPr>
-      <w:r>
-        <w:rPr>
-          <w:b/>
-          <w:lang w:val="en-US"/>
-        </w:rPr>
-        <w:t>Advanced exercise A6</w:t>
-      </w:r>
-      <w:r>
-        <w:rPr>
-          <w:b/>
-          <w:lang w:val="en-US"/>
-        </w:rPr>
-        <w:t>:</w:t>
-      </w:r>
-    </w:p>
-    <w:p>
-      <w:pPr>
-        <w:rPr>
-          <w:lang w:val="en-US"/>
-        </w:rPr>
-      </w:pPr>
-      <w:r>
-        <w:rPr>
-          <w:lang w:val="en-US"/>
-        </w:rPr>
-        <w:t>It has become increasingly difficult to sell the console chat program you wrote in the previous exercise.</w:t>
-      </w:r>
-    </w:p>
-    <w:p>
-      <w:pPr>
-        <w:rPr>
-          <w:lang w:val="en-US"/>
-        </w:rPr>
-      </w:pPr>
-      <w:r>
-        <w:rPr>
-          <w:lang w:val="en-US"/>
-        </w:rPr>
-        <w:t xml:space="preserve">Youngsters have stopped using the console… they want nice and shiny </w:t>
-      </w:r>
-      <w:r>
-        <w:rPr>
-          <w:lang w:val="en-US"/>
-        </w:rPr>
-        <w:t>WPF</w:t>
-      </w:r>
-      <w:r>
-        <w:rPr>
-          <w:lang w:val="en-US"/>
-        </w:rPr>
-        <w:t xml:space="preserve"> programs instead. </w:t>
-      </w:r>
-    </w:p>
-    <w:p>
-      <w:pPr>
-        <w:rPr>
-          <w:lang w:val="en-US"/>
-        </w:rPr>
-      </w:pPr>
-      <w:r>
-        <w:rPr>
-          <w:lang w:val="en-US"/>
-        </w:rPr>
-        <w:t>And all the old people have either bought your program or are using Linux.</w:t>
-      </w:r>
-    </w:p>
-    <w:p>
-      <w:pPr>
-        <w:rPr>
-          <w:lang w:val="en-US"/>
-        </w:rPr>
-      </w:pPr>
-    </w:p>
-    <w:p>
-      <w:pPr>
+        <w:t xml:space="preserve"> and </w:t>
+      </w:r>
+      <w:proofErr w:type="spellStart"/>
+      <w:r>
         <w:rPr>
           <w:i/>
           <w:lang w:val="en-US"/>
         </w:rPr>
-      </w:pPr>
-      <w:r>
-        <w:rPr>
-          <w:i/>
-          <w:lang w:val="en-US"/>
-        </w:rPr>
-        <w:t>So…</w:t>
-      </w:r>
-    </w:p>
-    <w:p>
-      <w:pPr>
-        <w:rPr>
-          <w:lang w:val="en-US"/>
-        </w:rPr>
-      </w:pPr>
-      <w:r>
-        <w:rPr>
-          <w:lang w:val="en-US"/>
-        </w:rPr>
-        <w:t xml:space="preserve">Your mission, </w:t>
-      </w:r>
-      <w:r>
-        <w:rPr>
-          <w:i/>
-          <w:lang w:val="en-US"/>
-        </w:rPr>
-        <w:t>should you choose to accept it</w:t>
-      </w:r>
-      <w:r>
-        <w:rPr>
-          <w:lang w:val="en-US"/>
-        </w:rPr>
-        <w:t xml:space="preserve">, is to create a </w:t>
-      </w:r>
-      <w:r>
-        <w:rPr>
-          <w:lang w:val="en-US"/>
-        </w:rPr>
-        <w:t>WPF</w:t>
-      </w:r>
-      <w:r>
-        <w:rPr>
-          <w:lang w:val="en-US"/>
-        </w:rPr>
-        <w:t xml:space="preserve"> chat program.</w:t>
-      </w:r>
-    </w:p>
-    <w:p>
-      <w:pPr>
-        <w:rPr>
-          <w:lang w:val="en-US"/>
-        </w:rPr>
-      </w:pPr>
-      <w:r>
-        <w:rPr>
-          <w:lang w:val="en-US"/>
-        </w:rPr>
-        <w:t xml:space="preserve">When your program starts, it </w:t>
-      </w:r>
-      <w:proofErr w:type="gramStart"/>
-      <w:r>
-        <w:rPr>
-          <w:lang w:val="en-US"/>
-        </w:rPr>
-        <w:t>shall</w:t>
-      </w:r>
-      <w:proofErr w:type="gramEnd"/>
-      <w:r>
-        <w:rPr>
-          <w:lang w:val="en-US"/>
-        </w:rPr>
-        <w:t xml:space="preserve"> connect to a chat program on one of your fellow </w:t>
-      </w:r>
-      <w:proofErr w:type="gramStart"/>
-      <w:r>
-        <w:rPr>
-          <w:lang w:val="en-US"/>
-        </w:rPr>
-        <w:t>students</w:t>
-      </w:r>
-      <w:proofErr w:type="gramEnd"/>
-      <w:r>
-        <w:rPr>
-          <w:lang w:val="en-US"/>
-        </w:rPr>
-        <w:t xml:space="preserve"> computers.</w:t>
-      </w:r>
-    </w:p>
-    <w:p>
-      <w:pPr>
-        <w:rPr>
-          <w:lang w:val="en-US"/>
-        </w:rPr>
-      </w:pPr>
-      <w:r>
-        <w:rPr>
-          <w:lang w:val="en-US"/>
-        </w:rPr>
-        <w:t>The text you enter shall be sent to the other computer and displayed in a nice chat window.</w:t>
-      </w:r>
-    </w:p>
-    <w:p>
-      <w:pPr>
-        <w:rPr>
-          <w:lang w:val="en-US"/>
-        </w:rPr>
-      </w:pPr>
-      <w:r>
-        <w:rPr>
-          <w:lang w:val="en-US"/>
-        </w:rPr>
-        <w:t>Likewise, text entered on the other computer shall be sent to your computer and displayed in a nice chat window.</w:t>
-      </w:r>
-    </w:p>
-    <w:p>
-      <w:pPr>
-        <w:rPr>
-          <w:lang w:val="en-US"/>
-        </w:rPr>
-      </w:pPr>
-    </w:p>
-    <w:p>
-      <w:pPr>
-        <w:rPr>
-          <w:lang w:val="en-US"/>
-        </w:rPr>
-      </w:pPr>
-      <w:r>
-        <w:rPr>
-          <w:lang w:val="en-US"/>
-        </w:rPr>
-        <w:t xml:space="preserve">Hint: You will probably still need a </w:t>
-      </w:r>
-      <w:r>
-        <w:rPr>
-          <w:i/>
-          <w:lang w:val="en-US"/>
-        </w:rPr>
-        <w:t>TCPListener</w:t>
-      </w:r>
-      <w:r>
-        <w:rPr>
-          <w:lang w:val="en-US"/>
-        </w:rPr>
-        <w:t xml:space="preserve"> and </w:t>
-      </w:r>
-      <w:proofErr w:type="spellStart"/>
-      <w:r>
-        <w:rPr>
-          <w:i/>
-          <w:lang w:val="en-US"/>
-        </w:rPr>
         <w:t>TCPClient</w:t>
       </w:r>
       <w:proofErr w:type="spellEnd"/>
@@ -1988,8 +1962,8 @@
       </w:pPr>
     </w:p>
     <w:sectPr>
-      <w:headerReference w:type="default" r:id="rId9"/>
-      <w:footerReference w:type="default" r:id="rId10"/>
+      <w:headerReference w:type="default" r:id="rId10"/>
+      <w:footerReference w:type="default" r:id="rId11"/>
       <w:pgSz w:w="11906" w:h="16838"/>
       <w:pgMar w:top="1560" w:right="1134" w:bottom="851" w:left="1134" w:header="708" w:footer="271" w:gutter="0"/>
       <w:cols w:space="708"/>
@@ -2000,7 +1974,7 @@
 </file>
 
 <file path=word/endnotes.xml><?xml version="1.0" encoding="utf-8"?>
-<w:endnotes xmlns:wpc="http://schemas.microsoft.com/office/word/2010/wordprocessingCanvas" xmlns:cx="http://schemas.microsoft.com/office/drawing/2014/chartex" xmlns:cx1="http://schemas.microsoft.com/office/drawing/2015/9/8/chartex" xmlns:cx2="http://schemas.microsoft.com/office/drawing/2015/10/21/chartex" xmlns:cx3="http://schemas.microsoft.com/office/drawing/2016/5/9/chartex" xmlns:cx4="http://schemas.microsoft.com/office/drawing/2016/5/10/chartex" xmlns:cx5="http://schemas.microsoft.com/office/drawing/2016/5/11/chartex" xmlns:cx6="http://schemas.microsoft.com/office/drawing/2016/5/12/chartex" xmlns:cx7="http://schemas.microsoft.com/office/drawing/2016/5/13/chartex" xmlns:cx8="http://schemas.microsoft.com/office/drawing/2016/5/14/chartex" xmlns:mc="http://schemas.openxmlformats.org/markup-compatibility/2006" xmlns:aink="http://schemas.microsoft.com/office/drawing/2016/ink" xmlns:am3d="http://schemas.microsoft.com/office/drawing/2017/model3d" xmlns:o="urn:schemas-microsoft-com:office:office" xmlns:oel="http://schemas.microsoft.com/office/2019/extlst" xmlns:r="http://schemas.openxmlformats.org/officeDocument/2006/relationships" xmlns:m="http://schemas.openxmlformats.org/officeDocument/2006/math" xmlns:v="urn:schemas-microsoft-com:vml" xmlns:wp14="http://schemas.microsoft.com/office/word/2010/wordprocessingDrawing" xmlns:wp="http://schemas.openxmlformats.org/drawingml/2006/wordprocessingDrawing" xmlns:w10="urn:schemas-microsoft-com:office:word" xmlns:w="http://schemas.openxmlformats.org/wordprocessingml/2006/main" xmlns:w14="http://schemas.microsoft.com/office/word/2010/wordml" xmlns:w15="http://schemas.microsoft.com/office/word/2012/wordml" xmlns:w16cex="http://schemas.microsoft.com/office/word/2018/wordml/cex" xmlns:w16cid="http://schemas.microsoft.com/office/word/2016/wordml/cid" xmlns:w16="http://schemas.microsoft.com/office/word/2018/wordml" xmlns:w16du="http://schemas.microsoft.com/office/word/2023/wordml/word16du" xmlns:w16sdtdh="http://schemas.microsoft.com/office/word/2020/wordml/sdtdatahash" xmlns:w16sdtfl="http://schemas.microsoft.com/office/word/2024/wordml/sdtformatlock" xmlns:w16se="http://schemas.microsoft.com/office/word/2015/wordml/symex" xmlns:wpg="http://schemas.microsoft.com/office/word/2010/wordprocessingGroup" xmlns:wpi="http://schemas.microsoft.com/office/word/2010/wordprocessingInk" xmlns:wne="http://schemas.microsoft.com/office/word/2006/wordml" xmlns:wps="http://schemas.microsoft.com/office/word/2010/wordprocessingShape" mc:Ignorable="w14 w15 w16se w16cid w16 w16cex w16sdtdh w16sdtfl w16du wp14">
+<w:endnotes xmlns:wpc="http://schemas.microsoft.com/office/word/2010/wordprocessingCanvas" xmlns:cx="http://schemas.microsoft.com/office/drawing/2014/chartex" xmlns:cx1="http://schemas.microsoft.com/office/drawing/2015/9/8/chartex" xmlns:cx2="http://schemas.microsoft.com/office/drawing/2015/10/21/chartex" xmlns:cx3="http://schemas.microsoft.com/office/drawing/2016/5/9/chartex" xmlns:cx4="http://schemas.microsoft.com/office/drawing/2016/5/10/chartex" xmlns:cx5="http://schemas.microsoft.com/office/drawing/2016/5/11/chartex" xmlns:cx6="http://schemas.microsoft.com/office/drawing/2016/5/12/chartex" xmlns:cx7="http://schemas.microsoft.com/office/drawing/2016/5/13/chartex" xmlns:cx8="http://schemas.microsoft.com/office/drawing/2016/5/14/chartex" xmlns:mc="http://schemas.openxmlformats.org/markup-compatibility/2006" xmlns:m="http://schemas.openxmlformats.org/officeDocument/2006/math" xmlns:aink="http://schemas.microsoft.com/office/drawing/2016/ink" xmlns:am3d="http://schemas.microsoft.com/office/drawing/2017/model3d" xmlns:oel="http://schemas.microsoft.com/office/2019/extlst" xmlns:r="http://schemas.openxmlformats.org/officeDocument/2006/relationships" xmlns:wp14="http://schemas.microsoft.com/office/word/2010/wordprocessingDrawing" xmlns:wp="http://schemas.openxmlformats.org/drawingml/2006/wordprocessingDrawing" xmlns:wpg="http://schemas.microsoft.com/office/word/2010/wordprocessingGroup" xmlns:wpi="http://schemas.microsoft.com/office/word/2010/wordprocessingInk" xmlns:wps="http://schemas.microsoft.com/office/word/2010/wordprocessingShape" xmlns:o="urn:schemas-microsoft-com:office:office" xmlns:v="urn:schemas-microsoft-com:vml" xmlns:w10="urn:schemas-microsoft-com:office:word" xmlns:w="http://schemas.openxmlformats.org/wordprocessingml/2006/main" xmlns:w14="http://schemas.microsoft.com/office/word/2010/wordml" xmlns:w15="http://schemas.microsoft.com/office/word/2012/wordml" xmlns:w16cex="http://schemas.microsoft.com/office/word/2018/wordml/cex" xmlns:w16cid="http://schemas.microsoft.com/office/word/2016/wordml/cid" xmlns:w16="http://schemas.microsoft.com/office/word/2018/wordml" xmlns:w16sdtdh="http://schemas.microsoft.com/office/word/2020/wordml/sdtdatahash" xmlns:w16sdtfl="http://schemas.microsoft.com/office/word/2024/wordml/sdtformatlock" xmlns:w16se="http://schemas.microsoft.com/office/word/2015/wordml/symex" xmlns:w16du="http://schemas.microsoft.com/office/word/2023/wordml/word16du" xmlns:wne="http://schemas.microsoft.com/office/word/2006/wordml" mc:Ignorable="w14 w15 w16se w16cid w16 w16cex w16sdtdh w16sdtfl w16du wp14">
   <w:endnote w:type="separator" w:id="-1">
     <w:p>
       <w:r>
@@ -2019,7 +1993,7 @@
 </file>
 
 <file path=word/footer1.xml><?xml version="1.0" encoding="utf-8"?>
-<w:ftr xmlns:wpc="http://schemas.microsoft.com/office/word/2010/wordprocessingCanvas" xmlns:cx="http://schemas.microsoft.com/office/drawing/2014/chartex" xmlns:cx1="http://schemas.microsoft.com/office/drawing/2015/9/8/chartex" xmlns:cx2="http://schemas.microsoft.com/office/drawing/2015/10/21/chartex" xmlns:cx3="http://schemas.microsoft.com/office/drawing/2016/5/9/chartex" xmlns:cx4="http://schemas.microsoft.com/office/drawing/2016/5/10/chartex" xmlns:cx5="http://schemas.microsoft.com/office/drawing/2016/5/11/chartex" xmlns:cx6="http://schemas.microsoft.com/office/drawing/2016/5/12/chartex" xmlns:cx7="http://schemas.microsoft.com/office/drawing/2016/5/13/chartex" xmlns:cx8="http://schemas.microsoft.com/office/drawing/2016/5/14/chartex" xmlns:mc="http://schemas.openxmlformats.org/markup-compatibility/2006" xmlns:aink="http://schemas.microsoft.com/office/drawing/2016/ink" xmlns:am3d="http://schemas.microsoft.com/office/drawing/2017/model3d" xmlns:o="urn:schemas-microsoft-com:office:office" xmlns:oel="http://schemas.microsoft.com/office/2019/extlst" xmlns:r="http://schemas.openxmlformats.org/officeDocument/2006/relationships" xmlns:m="http://schemas.openxmlformats.org/officeDocument/2006/math" xmlns:v="urn:schemas-microsoft-com:vml" xmlns:wp14="http://schemas.microsoft.com/office/word/2010/wordprocessingDrawing" xmlns:wp="http://schemas.openxmlformats.org/drawingml/2006/wordprocessingDrawing" xmlns:w10="urn:schemas-microsoft-com:office:word" xmlns:w="http://schemas.openxmlformats.org/wordprocessingml/2006/main" xmlns:w14="http://schemas.microsoft.com/office/word/2010/wordml" xmlns:w15="http://schemas.microsoft.com/office/word/2012/wordml" xmlns:w16cex="http://schemas.microsoft.com/office/word/2018/wordml/cex" xmlns:w16cid="http://schemas.microsoft.com/office/word/2016/wordml/cid" xmlns:w16="http://schemas.microsoft.com/office/word/2018/wordml" xmlns:w16du="http://schemas.microsoft.com/office/word/2023/wordml/word16du" xmlns:w16sdtdh="http://schemas.microsoft.com/office/word/2020/wordml/sdtdatahash" xmlns:w16sdtfl="http://schemas.microsoft.com/office/word/2024/wordml/sdtformatlock" xmlns:w16se="http://schemas.microsoft.com/office/word/2015/wordml/symex" xmlns:wpg="http://schemas.microsoft.com/office/word/2010/wordprocessingGroup" xmlns:wpi="http://schemas.microsoft.com/office/word/2010/wordprocessingInk" xmlns:wne="http://schemas.microsoft.com/office/word/2006/wordml" xmlns:wps="http://schemas.microsoft.com/office/word/2010/wordprocessingShape" mc:Ignorable="w14 w15 w16se w16cid w16 w16cex w16sdtdh w16sdtfl w16du wp14">
+<w:ftr xmlns:wpc="http://schemas.microsoft.com/office/word/2010/wordprocessingCanvas" xmlns:cx="http://schemas.microsoft.com/office/drawing/2014/chartex" xmlns:cx1="http://schemas.microsoft.com/office/drawing/2015/9/8/chartex" xmlns:cx2="http://schemas.microsoft.com/office/drawing/2015/10/21/chartex" xmlns:cx3="http://schemas.microsoft.com/office/drawing/2016/5/9/chartex" xmlns:cx4="http://schemas.microsoft.com/office/drawing/2016/5/10/chartex" xmlns:cx5="http://schemas.microsoft.com/office/drawing/2016/5/11/chartex" xmlns:cx6="http://schemas.microsoft.com/office/drawing/2016/5/12/chartex" xmlns:cx7="http://schemas.microsoft.com/office/drawing/2016/5/13/chartex" xmlns:cx8="http://schemas.microsoft.com/office/drawing/2016/5/14/chartex" xmlns:mc="http://schemas.openxmlformats.org/markup-compatibility/2006" xmlns:m="http://schemas.openxmlformats.org/officeDocument/2006/math" xmlns:aink="http://schemas.microsoft.com/office/drawing/2016/ink" xmlns:am3d="http://schemas.microsoft.com/office/drawing/2017/model3d" xmlns:oel="http://schemas.microsoft.com/office/2019/extlst" xmlns:r="http://schemas.openxmlformats.org/officeDocument/2006/relationships" xmlns:wp14="http://schemas.microsoft.com/office/word/2010/wordprocessingDrawing" xmlns:wp="http://schemas.openxmlformats.org/drawingml/2006/wordprocessingDrawing" xmlns:wpg="http://schemas.microsoft.com/office/word/2010/wordprocessingGroup" xmlns:wpi="http://schemas.microsoft.com/office/word/2010/wordprocessingInk" xmlns:wps="http://schemas.microsoft.com/office/word/2010/wordprocessingShape" xmlns:o="urn:schemas-microsoft-com:office:office" xmlns:v="urn:schemas-microsoft-com:vml" xmlns:w10="urn:schemas-microsoft-com:office:word" xmlns:w="http://schemas.openxmlformats.org/wordprocessingml/2006/main" xmlns:w14="http://schemas.microsoft.com/office/word/2010/wordml" xmlns:w15="http://schemas.microsoft.com/office/word/2012/wordml" xmlns:w16cex="http://schemas.microsoft.com/office/word/2018/wordml/cex" xmlns:w16cid="http://schemas.microsoft.com/office/word/2016/wordml/cid" xmlns:w16="http://schemas.microsoft.com/office/word/2018/wordml" xmlns:w16sdtdh="http://schemas.microsoft.com/office/word/2020/wordml/sdtdatahash" xmlns:w16sdtfl="http://schemas.microsoft.com/office/word/2024/wordml/sdtformatlock" xmlns:w16se="http://schemas.microsoft.com/office/word/2015/wordml/symex" xmlns:w16du="http://schemas.microsoft.com/office/word/2023/wordml/word16du" xmlns:wne="http://schemas.microsoft.com/office/word/2006/wordml" mc:Ignorable="w14 w15 w16se w16cid w16 w16cex w16sdtdh w16sdtfl w16du wp14">
   <w:sdt>
     <w:sdtPr>
       <w:rPr>
@@ -2183,7 +2157,7 @@
 </file>
 
 <file path=word/footnotes.xml><?xml version="1.0" encoding="utf-8"?>
-<w:footnotes xmlns:wpc="http://schemas.microsoft.com/office/word/2010/wordprocessingCanvas" xmlns:cx="http://schemas.microsoft.com/office/drawing/2014/chartex" xmlns:cx1="http://schemas.microsoft.com/office/drawing/2015/9/8/chartex" xmlns:cx2="http://schemas.microsoft.com/office/drawing/2015/10/21/chartex" xmlns:cx3="http://schemas.microsoft.com/office/drawing/2016/5/9/chartex" xmlns:cx4="http://schemas.microsoft.com/office/drawing/2016/5/10/chartex" xmlns:cx5="http://schemas.microsoft.com/office/drawing/2016/5/11/chartex" xmlns:cx6="http://schemas.microsoft.com/office/drawing/2016/5/12/chartex" xmlns:cx7="http://schemas.microsoft.com/office/drawing/2016/5/13/chartex" xmlns:cx8="http://schemas.microsoft.com/office/drawing/2016/5/14/chartex" xmlns:mc="http://schemas.openxmlformats.org/markup-compatibility/2006" xmlns:aink="http://schemas.microsoft.com/office/drawing/2016/ink" xmlns:am3d="http://schemas.microsoft.com/office/drawing/2017/model3d" xmlns:o="urn:schemas-microsoft-com:office:office" xmlns:oel="http://schemas.microsoft.com/office/2019/extlst" xmlns:r="http://schemas.openxmlformats.org/officeDocument/2006/relationships" xmlns:m="http://schemas.openxmlformats.org/officeDocument/2006/math" xmlns:v="urn:schemas-microsoft-com:vml" xmlns:wp14="http://schemas.microsoft.com/office/word/2010/wordprocessingDrawing" xmlns:wp="http://schemas.openxmlformats.org/drawingml/2006/wordprocessingDrawing" xmlns:w10="urn:schemas-microsoft-com:office:word" xmlns:w="http://schemas.openxmlformats.org/wordprocessingml/2006/main" xmlns:w14="http://schemas.microsoft.com/office/word/2010/wordml" xmlns:w15="http://schemas.microsoft.com/office/word/2012/wordml" xmlns:w16cex="http://schemas.microsoft.com/office/word/2018/wordml/cex" xmlns:w16cid="http://schemas.microsoft.com/office/word/2016/wordml/cid" xmlns:w16="http://schemas.microsoft.com/office/word/2018/wordml" xmlns:w16du="http://schemas.microsoft.com/office/word/2023/wordml/word16du" xmlns:w16sdtdh="http://schemas.microsoft.com/office/word/2020/wordml/sdtdatahash" xmlns:w16sdtfl="http://schemas.microsoft.com/office/word/2024/wordml/sdtformatlock" xmlns:w16se="http://schemas.microsoft.com/office/word/2015/wordml/symex" xmlns:wpg="http://schemas.microsoft.com/office/word/2010/wordprocessingGroup" xmlns:wpi="http://schemas.microsoft.com/office/word/2010/wordprocessingInk" xmlns:wne="http://schemas.microsoft.com/office/word/2006/wordml" xmlns:wps="http://schemas.microsoft.com/office/word/2010/wordprocessingShape" mc:Ignorable="w14 w15 w16se w16cid w16 w16cex w16sdtdh w16sdtfl w16du wp14">
+<w:footnotes xmlns:wpc="http://schemas.microsoft.com/office/word/2010/wordprocessingCanvas" xmlns:cx="http://schemas.microsoft.com/office/drawing/2014/chartex" xmlns:cx1="http://schemas.microsoft.com/office/drawing/2015/9/8/chartex" xmlns:cx2="http://schemas.microsoft.com/office/drawing/2015/10/21/chartex" xmlns:cx3="http://schemas.microsoft.com/office/drawing/2016/5/9/chartex" xmlns:cx4="http://schemas.microsoft.com/office/drawing/2016/5/10/chartex" xmlns:cx5="http://schemas.microsoft.com/office/drawing/2016/5/11/chartex" xmlns:cx6="http://schemas.microsoft.com/office/drawing/2016/5/12/chartex" xmlns:cx7="http://schemas.microsoft.com/office/drawing/2016/5/13/chartex" xmlns:cx8="http://schemas.microsoft.com/office/drawing/2016/5/14/chartex" xmlns:mc="http://schemas.openxmlformats.org/markup-compatibility/2006" xmlns:m="http://schemas.openxmlformats.org/officeDocument/2006/math" xmlns:aink="http://schemas.microsoft.com/office/drawing/2016/ink" xmlns:am3d="http://schemas.microsoft.com/office/drawing/2017/model3d" xmlns:oel="http://schemas.microsoft.com/office/2019/extlst" xmlns:r="http://schemas.openxmlformats.org/officeDocument/2006/relationships" xmlns:wp14="http://schemas.microsoft.com/office/word/2010/wordprocessingDrawing" xmlns:wp="http://schemas.openxmlformats.org/drawingml/2006/wordprocessingDrawing" xmlns:wpg="http://schemas.microsoft.com/office/word/2010/wordprocessingGroup" xmlns:wpi="http://schemas.microsoft.com/office/word/2010/wordprocessingInk" xmlns:wps="http://schemas.microsoft.com/office/word/2010/wordprocessingShape" xmlns:o="urn:schemas-microsoft-com:office:office" xmlns:v="urn:schemas-microsoft-com:vml" xmlns:w10="urn:schemas-microsoft-com:office:word" xmlns:w="http://schemas.openxmlformats.org/wordprocessingml/2006/main" xmlns:w14="http://schemas.microsoft.com/office/word/2010/wordml" xmlns:w15="http://schemas.microsoft.com/office/word/2012/wordml" xmlns:w16cex="http://schemas.microsoft.com/office/word/2018/wordml/cex" xmlns:w16cid="http://schemas.microsoft.com/office/word/2016/wordml/cid" xmlns:w16="http://schemas.microsoft.com/office/word/2018/wordml" xmlns:w16sdtdh="http://schemas.microsoft.com/office/word/2020/wordml/sdtdatahash" xmlns:w16sdtfl="http://schemas.microsoft.com/office/word/2024/wordml/sdtformatlock" xmlns:w16se="http://schemas.microsoft.com/office/word/2015/wordml/symex" xmlns:w16du="http://schemas.microsoft.com/office/word/2023/wordml/word16du" xmlns:wne="http://schemas.microsoft.com/office/word/2006/wordml" mc:Ignorable="w14 w15 w16se w16cid w16 w16cex w16sdtdh w16sdtfl w16du wp14">
   <w:footnote w:type="separator" w:id="-1">
     <w:p>
       <w:r>
@@ -2202,7 +2176,7 @@
 </file>
 
 <file path=word/header1.xml><?xml version="1.0" encoding="utf-8"?>
-<w:hdr xmlns:wpc="http://schemas.microsoft.com/office/word/2010/wordprocessingCanvas" xmlns:cx="http://schemas.microsoft.com/office/drawing/2014/chartex" xmlns:cx1="http://schemas.microsoft.com/office/drawing/2015/9/8/chartex" xmlns:cx2="http://schemas.microsoft.com/office/drawing/2015/10/21/chartex" xmlns:cx3="http://schemas.microsoft.com/office/drawing/2016/5/9/chartex" xmlns:cx4="http://schemas.microsoft.com/office/drawing/2016/5/10/chartex" xmlns:cx5="http://schemas.microsoft.com/office/drawing/2016/5/11/chartex" xmlns:cx6="http://schemas.microsoft.com/office/drawing/2016/5/12/chartex" xmlns:cx7="http://schemas.microsoft.com/office/drawing/2016/5/13/chartex" xmlns:cx8="http://schemas.microsoft.com/office/drawing/2016/5/14/chartex" xmlns:mc="http://schemas.openxmlformats.org/markup-compatibility/2006" xmlns:aink="http://schemas.microsoft.com/office/drawing/2016/ink" xmlns:am3d="http://schemas.microsoft.com/office/drawing/2017/model3d" xmlns:o="urn:schemas-microsoft-com:office:office" xmlns:oel="http://schemas.microsoft.com/office/2019/extlst" xmlns:r="http://schemas.openxmlformats.org/officeDocument/2006/relationships" xmlns:m="http://schemas.openxmlformats.org/officeDocument/2006/math" xmlns:v="urn:schemas-microsoft-com:vml" xmlns:wp14="http://schemas.microsoft.com/office/word/2010/wordprocessingDrawing" xmlns:wp="http://schemas.openxmlformats.org/drawingml/2006/wordprocessingDrawing" xmlns:w10="urn:schemas-microsoft-com:office:word" xmlns:w="http://schemas.openxmlformats.org/wordprocessingml/2006/main" xmlns:w14="http://schemas.microsoft.com/office/word/2010/wordml" xmlns:w15="http://schemas.microsoft.com/office/word/2012/wordml" xmlns:w16cex="http://schemas.microsoft.com/office/word/2018/wordml/cex" xmlns:w16cid="http://schemas.microsoft.com/office/word/2016/wordml/cid" xmlns:w16="http://schemas.microsoft.com/office/word/2018/wordml" xmlns:w16du="http://schemas.microsoft.com/office/word/2023/wordml/word16du" xmlns:w16sdtdh="http://schemas.microsoft.com/office/word/2020/wordml/sdtdatahash" xmlns:w16sdtfl="http://schemas.microsoft.com/office/word/2024/wordml/sdtformatlock" xmlns:w16se="http://schemas.microsoft.com/office/word/2015/wordml/symex" xmlns:wpg="http://schemas.microsoft.com/office/word/2010/wordprocessingGroup" xmlns:wpi="http://schemas.microsoft.com/office/word/2010/wordprocessingInk" xmlns:wne="http://schemas.microsoft.com/office/word/2006/wordml" xmlns:wps="http://schemas.microsoft.com/office/word/2010/wordprocessingShape" mc:Ignorable="w14 w15 w16se w16cid w16 w16cex w16sdtdh w16sdtfl w16du wp14">
+<w:hdr xmlns:wpc="http://schemas.microsoft.com/office/word/2010/wordprocessingCanvas" xmlns:cx="http://schemas.microsoft.com/office/drawing/2014/chartex" xmlns:cx1="http://schemas.microsoft.com/office/drawing/2015/9/8/chartex" xmlns:cx2="http://schemas.microsoft.com/office/drawing/2015/10/21/chartex" xmlns:cx3="http://schemas.microsoft.com/office/drawing/2016/5/9/chartex" xmlns:cx4="http://schemas.microsoft.com/office/drawing/2016/5/10/chartex" xmlns:cx5="http://schemas.microsoft.com/office/drawing/2016/5/11/chartex" xmlns:cx6="http://schemas.microsoft.com/office/drawing/2016/5/12/chartex" xmlns:cx7="http://schemas.microsoft.com/office/drawing/2016/5/13/chartex" xmlns:cx8="http://schemas.microsoft.com/office/drawing/2016/5/14/chartex" xmlns:mc="http://schemas.openxmlformats.org/markup-compatibility/2006" xmlns:m="http://schemas.openxmlformats.org/officeDocument/2006/math" xmlns:aink="http://schemas.microsoft.com/office/drawing/2016/ink" xmlns:am3d="http://schemas.microsoft.com/office/drawing/2017/model3d" xmlns:oel="http://schemas.microsoft.com/office/2019/extlst" xmlns:r="http://schemas.openxmlformats.org/officeDocument/2006/relationships" xmlns:wp14="http://schemas.microsoft.com/office/word/2010/wordprocessingDrawing" xmlns:wp="http://schemas.openxmlformats.org/drawingml/2006/wordprocessingDrawing" xmlns:wpg="http://schemas.microsoft.com/office/word/2010/wordprocessingGroup" xmlns:wpi="http://schemas.microsoft.com/office/word/2010/wordprocessingInk" xmlns:wps="http://schemas.microsoft.com/office/word/2010/wordprocessingShape" xmlns:o="urn:schemas-microsoft-com:office:office" xmlns:v="urn:schemas-microsoft-com:vml" xmlns:w10="urn:schemas-microsoft-com:office:word" xmlns:w="http://schemas.openxmlformats.org/wordprocessingml/2006/main" xmlns:w14="http://schemas.microsoft.com/office/word/2010/wordml" xmlns:w15="http://schemas.microsoft.com/office/word/2012/wordml" xmlns:w16cex="http://schemas.microsoft.com/office/word/2018/wordml/cex" xmlns:w16cid="http://schemas.microsoft.com/office/word/2016/wordml/cid" xmlns:w16="http://schemas.microsoft.com/office/word/2018/wordml" xmlns:w16sdtdh="http://schemas.microsoft.com/office/word/2020/wordml/sdtdatahash" xmlns:w16sdtfl="http://schemas.microsoft.com/office/word/2024/wordml/sdtformatlock" xmlns:w16se="http://schemas.microsoft.com/office/word/2015/wordml/symex" xmlns:w16du="http://schemas.microsoft.com/office/word/2023/wordml/word16du" xmlns:wne="http://schemas.microsoft.com/office/word/2006/wordml" mc:Ignorable="w14 w15 w16se w16cid w16 w16cex w16sdtdh w16sdtfl w16du wp14">
   <w:p>
     <w:pPr>
       <w:pStyle w:val="Header"/>
@@ -2418,7 +2392,7 @@
 </file>
 
 <file path=word/numbering.xml><?xml version="1.0" encoding="utf-8"?>
-<w:numbering xmlns:wpc="http://schemas.microsoft.com/office/word/2010/wordprocessingCanvas" xmlns:cx="http://schemas.microsoft.com/office/drawing/2014/chartex" xmlns:cx1="http://schemas.microsoft.com/office/drawing/2015/9/8/chartex" xmlns:cx2="http://schemas.microsoft.com/office/drawing/2015/10/21/chartex" xmlns:cx3="http://schemas.microsoft.com/office/drawing/2016/5/9/chartex" xmlns:cx4="http://schemas.microsoft.com/office/drawing/2016/5/10/chartex" xmlns:cx5="http://schemas.microsoft.com/office/drawing/2016/5/11/chartex" xmlns:cx6="http://schemas.microsoft.com/office/drawing/2016/5/12/chartex" xmlns:cx7="http://schemas.microsoft.com/office/drawing/2016/5/13/chartex" xmlns:cx8="http://schemas.microsoft.com/office/drawing/2016/5/14/chartex" xmlns:mc="http://schemas.openxmlformats.org/markup-compatibility/2006" xmlns:aink="http://schemas.microsoft.com/office/drawing/2016/ink" xmlns:am3d="http://schemas.microsoft.com/office/drawing/2017/model3d" xmlns:o="urn:schemas-microsoft-com:office:office" xmlns:oel="http://schemas.microsoft.com/office/2019/extlst" xmlns:r="http://schemas.openxmlformats.org/officeDocument/2006/relationships" xmlns:m="http://schemas.openxmlformats.org/officeDocument/2006/math" xmlns:v="urn:schemas-microsoft-com:vml" xmlns:wp14="http://schemas.microsoft.com/office/word/2010/wordprocessingDrawing" xmlns:wp="http://schemas.openxmlformats.org/drawingml/2006/wordprocessingDrawing" xmlns:w10="urn:schemas-microsoft-com:office:word" xmlns:w="http://schemas.openxmlformats.org/wordprocessingml/2006/main" xmlns:w14="http://schemas.microsoft.com/office/word/2010/wordml" xmlns:w15="http://schemas.microsoft.com/office/word/2012/wordml" xmlns:w16cex="http://schemas.microsoft.com/office/word/2018/wordml/cex" xmlns:w16cid="http://schemas.microsoft.com/office/word/2016/wordml/cid" xmlns:w16="http://schemas.microsoft.com/office/word/2018/wordml" xmlns:w16du="http://schemas.microsoft.com/office/word/2023/wordml/word16du" xmlns:w16sdtdh="http://schemas.microsoft.com/office/word/2020/wordml/sdtdatahash" xmlns:w16sdtfl="http://schemas.microsoft.com/office/word/2024/wordml/sdtformatlock" xmlns:w16se="http://schemas.microsoft.com/office/word/2015/wordml/symex" xmlns:wpg="http://schemas.microsoft.com/office/word/2010/wordprocessingGroup" xmlns:wpi="http://schemas.microsoft.com/office/word/2010/wordprocessingInk" xmlns:wne="http://schemas.microsoft.com/office/word/2006/wordml" xmlns:wps="http://schemas.microsoft.com/office/word/2010/wordprocessingShape" mc:Ignorable="w14 w15 w16se w16cid w16 w16cex w16sdtdh w16sdtfl w16du wp14">
+<w:numbering xmlns:wpc="http://schemas.microsoft.com/office/word/2010/wordprocessingCanvas" xmlns:cx="http://schemas.microsoft.com/office/drawing/2014/chartex" xmlns:cx1="http://schemas.microsoft.com/office/drawing/2015/9/8/chartex" xmlns:cx2="http://schemas.microsoft.com/office/drawing/2015/10/21/chartex" xmlns:cx3="http://schemas.microsoft.com/office/drawing/2016/5/9/chartex" xmlns:cx4="http://schemas.microsoft.com/office/drawing/2016/5/10/chartex" xmlns:cx5="http://schemas.microsoft.com/office/drawing/2016/5/11/chartex" xmlns:cx6="http://schemas.microsoft.com/office/drawing/2016/5/12/chartex" xmlns:cx7="http://schemas.microsoft.com/office/drawing/2016/5/13/chartex" xmlns:cx8="http://schemas.microsoft.com/office/drawing/2016/5/14/chartex" xmlns:mc="http://schemas.openxmlformats.org/markup-compatibility/2006" xmlns:m="http://schemas.openxmlformats.org/officeDocument/2006/math" xmlns:aink="http://schemas.microsoft.com/office/drawing/2016/ink" xmlns:am3d="http://schemas.microsoft.com/office/drawing/2017/model3d" xmlns:oel="http://schemas.microsoft.com/office/2019/extlst" xmlns:r="http://schemas.openxmlformats.org/officeDocument/2006/relationships" xmlns:wp14="http://schemas.microsoft.com/office/word/2010/wordprocessingDrawing" xmlns:wp="http://schemas.openxmlformats.org/drawingml/2006/wordprocessingDrawing" xmlns:wpg="http://schemas.microsoft.com/office/word/2010/wordprocessingGroup" xmlns:wpi="http://schemas.microsoft.com/office/word/2010/wordprocessingInk" xmlns:wps="http://schemas.microsoft.com/office/word/2010/wordprocessingShape" xmlns:o="urn:schemas-microsoft-com:office:office" xmlns:v="urn:schemas-microsoft-com:vml" xmlns:w10="urn:schemas-microsoft-com:office:word" xmlns:w="http://schemas.openxmlformats.org/wordprocessingml/2006/main" xmlns:w14="http://schemas.microsoft.com/office/word/2010/wordml" xmlns:w15="http://schemas.microsoft.com/office/word/2012/wordml" xmlns:w16cex="http://schemas.microsoft.com/office/word/2018/wordml/cex" xmlns:w16cid="http://schemas.microsoft.com/office/word/2016/wordml/cid" xmlns:w16="http://schemas.microsoft.com/office/word/2018/wordml" xmlns:w16sdtdh="http://schemas.microsoft.com/office/word/2020/wordml/sdtdatahash" xmlns:w16sdtfl="http://schemas.microsoft.com/office/word/2024/wordml/sdtformatlock" xmlns:w16se="http://schemas.microsoft.com/office/word/2015/wordml/symex" xmlns:w16du="http://schemas.microsoft.com/office/word/2023/wordml/word16du" xmlns:wne="http://schemas.microsoft.com/office/word/2006/wordml" mc:Ignorable="w14 w15 w16se w16cid w16 w16cex w16sdtdh w16sdtfl w16du wp14">
   <w:abstractNum w:abstractNumId="0" w15:restartNumberingAfterBreak="0">
     <w:nsid w:val="2DFB2120"/>
     <w:multiLevelType w:val="hybridMultilevel"/>
@@ -3128,7 +3102,7 @@
 </file>
 
 <file path=word/styles.xml><?xml version="1.0" encoding="utf-8"?>
-<w:styles xmlns:mc="http://schemas.openxmlformats.org/markup-compatibility/2006" xmlns:r="http://schemas.openxmlformats.org/officeDocument/2006/relationships" xmlns:w="http://schemas.openxmlformats.org/wordprocessingml/2006/main" xmlns:w14="http://schemas.microsoft.com/office/word/2010/wordml" xmlns:w15="http://schemas.microsoft.com/office/word/2012/wordml" xmlns:w16cex="http://schemas.microsoft.com/office/word/2018/wordml/cex" xmlns:w16cid="http://schemas.microsoft.com/office/word/2016/wordml/cid" xmlns:w16="http://schemas.microsoft.com/office/word/2018/wordml" xmlns:w16du="http://schemas.microsoft.com/office/word/2023/wordml/word16du" xmlns:w16sdtdh="http://schemas.microsoft.com/office/word/2020/wordml/sdtdatahash" xmlns:w16sdtfl="http://schemas.microsoft.com/office/word/2024/wordml/sdtformatlock" xmlns:w16se="http://schemas.microsoft.com/office/word/2015/wordml/symex" mc:Ignorable="w14 w15 w16se w16cid w16 w16cex w16sdtdh w16sdtfl w16du">
+<w:styles xmlns:mc="http://schemas.openxmlformats.org/markup-compatibility/2006" xmlns:r="http://schemas.openxmlformats.org/officeDocument/2006/relationships" xmlns:w="http://schemas.openxmlformats.org/wordprocessingml/2006/main" xmlns:w14="http://schemas.microsoft.com/office/word/2010/wordml" xmlns:w15="http://schemas.microsoft.com/office/word/2012/wordml" xmlns:w16cex="http://schemas.microsoft.com/office/word/2018/wordml/cex" xmlns:w16cid="http://schemas.microsoft.com/office/word/2016/wordml/cid" xmlns:w16="http://schemas.microsoft.com/office/word/2018/wordml" xmlns:w16sdtdh="http://schemas.microsoft.com/office/word/2020/wordml/sdtdatahash" xmlns:w16sdtfl="http://schemas.microsoft.com/office/word/2024/wordml/sdtformatlock" xmlns:w16se="http://schemas.microsoft.com/office/word/2015/wordml/symex" xmlns:w16du="http://schemas.microsoft.com/office/word/2023/wordml/word16du" mc:Ignorable="w14 w15 w16se w16cid w16 w16cex w16sdtdh w16sdtfl w16du">
   <w:docDefaults>
     <w:rPrDefault>
       <w:rPr>
@@ -3923,6 +3897,18 @@
     <w:basedOn w:val="DefaultParagraphFont"/>
     <w:rsid w:val="00292ACD"/>
   </w:style>
+  <w:style w:type="character" w:styleId="UnresolvedMention">
+    <w:name w:val="Unresolved Mention"/>
+    <w:basedOn w:val="DefaultParagraphFont"/>
+    <w:uiPriority w:val="99"/>
+    <w:semiHidden/>
+    <w:unhideWhenUsed/>
+    <w:rsid w:val="001310FF"/>
+    <w:rPr>
+      <w:color w:val="605E5C"/>
+      <w:shd w:val="clear" w:color="auto" w:fill="E1DFDD"/>
+    </w:rPr>
+  </w:style>
 </w:styles>
 </file>
 

</xml_diff>